<commit_message>
Fix offer letter header/address polish and replace bottom banner
- Header table: both cells (logo left, address right -- already the
  correct layout) explicitly nil-bordered and vertically centered, so
  they align cleanly instead of both sitting top-aligned by default.
- Candidate To/Name/Address/Email/Phone block: was ~1pt between lines
  (essentially none), bumped to 4pt so it reads as a proper block;
  candidate's name bumped to 12pt for a touch more prominence.
- Bottom banner image was a badly-cropped sliver of the brand banner
  (2508x239, showing only a fragment of text) -- replaced in place
  with the correct full banner and corrected aspect ratio, same slot
  right after the signature block. No new image added, existing one
  swapped.

Applied identically across all three letter types via
scripts/fix-offer-letter-templates.py (kept for re-running if the
templates are regenerated from scratch).

Co-Authored-By: Claude Sonnet 5 <noreply@anthropic.com>
</commit_message>
<xml_diff>
--- a/offerletter/full-time/sloud-fulltime-letter-template.docx
+++ b/offerletter/full-time/sloud-fulltime-letter-template.docx
@@ -29,7 +29,13 @@
               <w:bottom w:type="dxa" w:w="0"/>
               <w:right w:type="dxa" w:w="0"/>
             </w:tcMar>
-            <w:vAlign w:val="top"/>
+            <w:vAlign w:val="center"/>
+            <w:tcBorders>
+              <w:top w:val="nil"/>
+              <w:left w:val="nil"/>
+              <w:bottom w:val="nil"/>
+              <w:right w:val="nil"/>
+            </w:tcBorders>
           </w:tcPr>
           <w:p>
             <w:pPr>
@@ -86,7 +92,13 @@
               <w:bottom w:type="dxa" w:w="0"/>
               <w:right w:type="dxa" w:w="0"/>
             </w:tcMar>
-            <w:vAlign w:val="top"/>
+            <w:vAlign w:val="center"/>
+            <w:tcBorders>
+              <w:top w:val="nil"/>
+              <w:left w:val="nil"/>
+              <w:bottom w:val="nil"/>
+              <w:right w:val="nil"/>
+            </w:tcBorders>
           </w:tcPr>
           <w:p>
             <w:pPr>
@@ -217,7 +229,7 @@
     </w:p>
     <w:p>
       <w:pPr>
-        <w:spacing w:after="20" w:line="264"/>
+        <w:spacing w:after="80" w:line="264"/>
       </w:pPr>
       <w:r>
         <w:rPr>
@@ -231,7 +243,7 @@
     </w:p>
     <w:p>
       <w:pPr>
-        <w:spacing w:after="20" w:line="264"/>
+        <w:spacing w:after="80" w:line="264"/>
       </w:pPr>
       <w:r>
         <w:rPr>
@@ -239,7 +251,7 @@
           <w:b/>
           <w:bCs/>
           <w:color w:val="1F2937"/>
-          <w:sz w:val="21"/>
+          <w:sz w:val="24"/>
           <w:szCs w:val="21"/>
         </w:rPr>
         <w:t xml:space="preserve">[Candidate Name]</w:t>
@@ -247,7 +259,7 @@
     </w:p>
     <w:p>
       <w:pPr>
-        <w:spacing w:after="20" w:line="264"/>
+        <w:spacing w:after="80" w:line="264"/>
       </w:pPr>
       <w:r>
         <w:rPr>
@@ -261,7 +273,7 @@
     </w:p>
     <w:p>
       <w:pPr>
-        <w:spacing w:after="20" w:line="264"/>
+        <w:spacing w:after="80" w:line="264"/>
       </w:pPr>
       <w:r>
         <w:rPr>
@@ -275,7 +287,7 @@
     </w:p>
     <w:p>
       <w:pPr>
-        <w:spacing w:after="230" w:line="264"/>
+        <w:spacing w:after="80" w:line="264"/>
       </w:pPr>
       <w:r>
         <w:rPr>
@@ -2352,7 +2364,7 @@
       <w:r>
         <w:drawing>
           <wp:inline distT="0" distB="0" distL="0" distR="0">
-            <wp:extent cx="4457700" cy="428625"/>
+            <wp:extent cx="4457700" cy="1114425"/>
             <wp:effectExtent t="0" r="0" b="0" l="0"/>
             <wp:docPr id="1" name="" descr="" title=""/>
             <wp:cNvGraphicFramePr>
@@ -2377,7 +2389,7 @@
                   <pic:spPr bwMode="auto">
                     <a:xfrm>
                       <a:off x="0" y="0"/>
-                      <a:ext cx="4457700" cy="428625"/>
+                      <a:ext cx="4457700" cy="1114425"/>
                     </a:xfrm>
                     <a:prstGeom prst="rect">
                       <a:avLst/>

</xml_diff>

<commit_message>
Attach default company signature to offer letter templates
Embeds a cropped, aspect-locked signature image (0.8in tall) under "For
Sloud Solutions" in all three offer-letter templates (full-time,
part-time, internship), replacing the blank underline. The candidate's
own signature line is left untouched. Adds scripts/add-default-signature.py
(same one-off-script pattern as fix-offer-letter-templates.py) so the
signature can be swapped later, plus the three source signature variants
in public/images/brand for future use.

Co-Authored-By: Claude Sonnet 5 <noreply@anthropic.com>
</commit_message>
<xml_diff>
--- a/offerletter/full-time/sloud-fulltime-letter-template.docx
+++ b/offerletter/full-time/sloud-fulltime-letter-template.docx
@@ -2220,13 +2220,38 @@
               <w:spacing w:after="50" w:line="264"/>
             </w:pPr>
             <w:r>
-              <w:rPr>
-                <w:rFonts w:ascii="Calibri" w:cs="Calibri" w:eastAsia="Calibri" w:hAnsi="Calibri"/>
-                <w:color w:val="1F2937"/>
-                <w:sz w:val="21"/>
-                <w:szCs w:val="21"/>
-              </w:rPr>
-              <w:t xml:space="preserve">________________________________</w:t>
+              <w:drawing>
+                <wp:inline xmlns:a="http://schemas.openxmlformats.org/drawingml/2006/main" xmlns:pic="http://schemas.openxmlformats.org/drawingml/2006/picture">
+                  <wp:extent cx="588186" cy="731520"/>
+                  <wp:docPr id="2" name="Picture 2"/>
+                  <wp:cNvGraphicFramePr>
+                    <a:graphicFrameLocks noChangeAspect="1"/>
+                  </wp:cNvGraphicFramePr>
+                  <a:graphic>
+                    <a:graphicData uri="http://schemas.openxmlformats.org/drawingml/2006/picture">
+                      <pic:pic>
+                        <pic:nvPicPr>
+                          <pic:cNvPr id="0" name="signature-default.png"/>
+                          <pic:cNvPicPr/>
+                        </pic:nvPicPr>
+                        <pic:blipFill>
+                          <a:blip r:embed="rId10"/>
+                          <a:stretch>
+                            <a:fillRect/>
+                          </a:stretch>
+                        </pic:blipFill>
+                        <pic:spPr>
+                          <a:xfrm>
+                            <a:off x="0" y="0"/>
+                            <a:ext cx="588186" cy="731520"/>
+                          </a:xfrm>
+                          <a:prstGeom prst="rect"/>
+                        </pic:spPr>
+                      </pic:pic>
+                    </a:graphicData>
+                  </a:graphic>
+                </wp:inline>
+              </w:drawing>
             </w:r>
           </w:p>
           <w:p>

</xml_diff>

<commit_message>
Label signature lines and auto-fill the company's signing date
Adds a small "Signature:" label above both the company's signature image
and the candidate's blank signature line, so it's clear what each line is
for. The company's "Date:" line now reads "Date: [DD Month YYYY]", which
offer-letter.ts already fills in from the letter date wherever it
appears, so it's auto-filled at generation time. The candidate's date
line stays blank, since that's filled in when they actually sign.

Co-Authored-By: Claude Sonnet 5 <noreply@anthropic.com>
</commit_message>
<xml_diff>
--- a/offerletter/full-time/sloud-fulltime-letter-template.docx
+++ b/offerletter/full-time/sloud-fulltime-letter-template.docx
@@ -2217,6 +2217,19 @@
           </w:p>
           <w:p>
             <w:pPr>
+              <w:spacing w:after="30"/>
+            </w:pPr>
+            <w:r>
+              <w:rPr>
+                <w:rFonts w:ascii="Calibri" w:hAnsi="Calibri"/>
+                <w:color w:val="94A3B8"/>
+                <w:sz w:val="16"/>
+              </w:rPr>
+              <w:t>Signature:</w:t>
+            </w:r>
+          </w:p>
+          <w:p>
+            <w:pPr>
               <w:spacing w:after="50" w:line="264"/>
             </w:pPr>
             <w:r>
@@ -2274,12 +2287,11 @@
             </w:pPr>
             <w:r>
               <w:rPr>
-                <w:rFonts w:ascii="Calibri" w:cs="Calibri" w:eastAsia="Calibri" w:hAnsi="Calibri"/>
+                <w:rFonts w:ascii="Calibri" w:hAnsi="Calibri"/>
                 <w:color w:val="64748B"/>
                 <w:sz w:val="19"/>
-                <w:szCs w:val="19"/>
-              </w:rPr>
-              <w:t xml:space="preserve">Date: ____________________</w:t>
+              </w:rPr>
+              <w:t>Date: [DD Month YYYY]</w:t>
             </w:r>
           </w:p>
         </w:tc>
@@ -2321,6 +2333,19 @@
                 <w:szCs w:val="21"/>
               </w:rPr>
               <w:t xml:space="preserve">Accepted by the Employee</w:t>
+            </w:r>
+          </w:p>
+          <w:p>
+            <w:pPr>
+              <w:spacing w:after="30"/>
+            </w:pPr>
+            <w:r>
+              <w:rPr>
+                <w:rFonts w:ascii="Calibri" w:hAnsi="Calibri"/>
+                <w:color w:val="94A3B8"/>
+                <w:sz w:val="16"/>
+              </w:rPr>
+              <w:t>Signature:</w:t>
             </w:r>
           </w:p>
           <w:p>

</xml_diff>